<commit_message>
Tree updates (5/22/25 draft)
</commit_message>
<xml_diff>
--- a/paper/DC Yanked text.docx
+++ b/paper/DC Yanked text.docx
@@ -386,25 +386,7 @@
           <w:sz w:val="22"/>
           <w:szCs w:val="22"/>
         </w:rPr>
-        <w:t xml:space="preserve"> values below 20) suggesting that these flies were morphologically </w:t>
-      </w:r>
-      <w:proofErr w:type="gramStart"/>
-      <w:r>
-        <w:rPr>
-          <w:rFonts w:ascii="Arial" w:hAnsi="Arial" w:cs="Arial"/>
-          <w:sz w:val="22"/>
-          <w:szCs w:val="22"/>
-        </w:rPr>
-        <w:t>similar to</w:t>
-      </w:r>
-      <w:proofErr w:type="gramEnd"/>
-      <w:r>
-        <w:rPr>
-          <w:rFonts w:ascii="Arial" w:hAnsi="Arial" w:cs="Arial"/>
-          <w:sz w:val="22"/>
-          <w:szCs w:val="22"/>
-        </w:rPr>
-        <w:t xml:space="preserve"> </w:t>
+        <w:t xml:space="preserve"> values below 20) suggesting that these flies were morphologically similar to </w:t>
       </w:r>
       <w:r>
         <w:rPr>
@@ -448,6 +430,413 @@
         </w:rPr>
         <w:t>.</w:t>
       </w:r>
+    </w:p>
+    <w:p>
+      <w:pPr>
+        <w:spacing w:line="360" w:lineRule="auto"/>
+        <w:ind w:firstLine="720"/>
+        <w:rPr>
+          <w:rFonts w:ascii="Arial" w:hAnsi="Arial" w:cs="Arial"/>
+          <w:sz w:val="22"/>
+          <w:szCs w:val="22"/>
+        </w:rPr>
+      </w:pPr>
+    </w:p>
+    <w:p>
+      <w:pPr>
+        <w:spacing w:line="360" w:lineRule="auto"/>
+        <w:ind w:firstLine="720"/>
+        <w:rPr>
+          <w:rFonts w:ascii="Arial" w:hAnsi="Arial" w:cs="Arial"/>
+          <w:sz w:val="22"/>
+          <w:szCs w:val="22"/>
+        </w:rPr>
+      </w:pPr>
+      <w:r>
+        <w:rPr>
+          <w:rFonts w:ascii="Arial" w:hAnsi="Arial" w:cs="Arial"/>
+          <w:sz w:val="22"/>
+          <w:szCs w:val="22"/>
+        </w:rPr>
+        <w:t xml:space="preserve">There was also evidence of reassortment between genotypes. </w:t>
+      </w:r>
+      <w:proofErr w:type="gramStart"/>
+      <w:r>
+        <w:rPr>
+          <w:rFonts w:ascii="Arial" w:hAnsi="Arial" w:cs="Arial"/>
+          <w:sz w:val="22"/>
+          <w:szCs w:val="22"/>
+        </w:rPr>
+        <w:t xml:space="preserve">Sample </w:t>
+      </w:r>
+      <w:r>
+        <w:rPr>
+          <w:rFonts w:ascii="Arial" w:hAnsi="Arial" w:cs="Arial"/>
+          <w:sz w:val="22"/>
+          <w:szCs w:val="22"/>
+        </w:rPr>
+        <w:t xml:space="preserve"> 500</w:t>
+      </w:r>
+      <w:proofErr w:type="gramEnd"/>
+      <w:r>
+        <w:rPr>
+          <w:rFonts w:ascii="Arial" w:hAnsi="Arial" w:cs="Arial"/>
+          <w:sz w:val="22"/>
+          <w:szCs w:val="22"/>
+        </w:rPr>
+        <w:t>-M-60</w:t>
+      </w:r>
+      <w:r>
+        <w:rPr>
+          <w:rFonts w:ascii="Arial" w:hAnsi="Arial" w:cs="Arial"/>
+          <w:sz w:val="22"/>
+          <w:szCs w:val="22"/>
+        </w:rPr>
+        <w:t>, from Colorado 2023, has two RNA 3 segments, one of each genotype while the RNA 1 and 2 segments had no other partial segments and are genotype B (</w:t>
+      </w:r>
+      <w:r>
+        <w:rPr>
+          <w:rFonts w:ascii="Arial" w:hAnsi="Arial" w:cs="Arial"/>
+          <w:b/>
+          <w:bCs/>
+          <w:sz w:val="22"/>
+          <w:szCs w:val="22"/>
+        </w:rPr>
+        <w:t xml:space="preserve">Fig. </w:t>
+      </w:r>
+      <w:r>
+        <w:rPr>
+          <w:rFonts w:ascii="Arial" w:hAnsi="Arial" w:cs="Arial"/>
+          <w:b/>
+          <w:bCs/>
+          <w:sz w:val="22"/>
+          <w:szCs w:val="22"/>
+        </w:rPr>
+        <w:t>10</w:t>
+      </w:r>
+      <w:r>
+        <w:rPr>
+          <w:rFonts w:ascii="Arial" w:hAnsi="Arial" w:cs="Arial"/>
+          <w:b/>
+          <w:bCs/>
+          <w:sz w:val="22"/>
+          <w:szCs w:val="22"/>
+        </w:rPr>
+        <w:t>, 1</w:t>
+      </w:r>
+      <w:r>
+        <w:rPr>
+          <w:rFonts w:ascii="Arial" w:hAnsi="Arial" w:cs="Arial"/>
+          <w:b/>
+          <w:bCs/>
+          <w:sz w:val="22"/>
+          <w:szCs w:val="22"/>
+        </w:rPr>
+        <w:t>1</w:t>
+      </w:r>
+      <w:r>
+        <w:rPr>
+          <w:rFonts w:ascii="Arial" w:hAnsi="Arial" w:cs="Arial"/>
+          <w:b/>
+          <w:bCs/>
+          <w:sz w:val="22"/>
+          <w:szCs w:val="22"/>
+        </w:rPr>
+        <w:t xml:space="preserve"> &amp; 1</w:t>
+      </w:r>
+      <w:r>
+        <w:rPr>
+          <w:rFonts w:ascii="Arial" w:hAnsi="Arial" w:cs="Arial"/>
+          <w:b/>
+          <w:bCs/>
+          <w:sz w:val="22"/>
+          <w:szCs w:val="22"/>
+        </w:rPr>
+        <w:t>2</w:t>
+      </w:r>
+      <w:r>
+        <w:rPr>
+          <w:rFonts w:ascii="Arial" w:hAnsi="Arial" w:cs="Arial"/>
+          <w:sz w:val="22"/>
+          <w:szCs w:val="22"/>
+        </w:rPr>
+        <w:t xml:space="preserve">). </w:t>
+      </w:r>
+    </w:p>
+    <w:p>
+      <w:pPr>
+        <w:spacing w:line="360" w:lineRule="auto"/>
+        <w:ind w:firstLine="720"/>
+        <w:rPr>
+          <w:rFonts w:ascii="Arial" w:hAnsi="Arial" w:cs="Arial"/>
+          <w:color w:val="000000"/>
+          <w:sz w:val="22"/>
+          <w:szCs w:val="22"/>
+        </w:rPr>
+      </w:pPr>
+      <w:r>
+        <w:rPr>
+          <w:rFonts w:ascii="Arial" w:hAnsi="Arial" w:cs="Arial"/>
+          <w:color w:val="000000"/>
+          <w:sz w:val="22"/>
+          <w:szCs w:val="22"/>
+        </w:rPr>
+        <w:t xml:space="preserve">The phenomenon of </w:t>
+      </w:r>
+      <w:commentRangeStart w:id="9"/>
+      <w:commentRangeStart w:id="10"/>
+      <w:r>
+        <w:rPr>
+          <w:rFonts w:ascii="Arial" w:hAnsi="Arial" w:cs="Arial"/>
+          <w:color w:val="000000"/>
+          <w:sz w:val="22"/>
+          <w:szCs w:val="22"/>
+        </w:rPr>
+        <w:t>superinfection exclusion</w:t>
+      </w:r>
+      <w:commentRangeEnd w:id="9"/>
+      <w:r>
+        <w:rPr>
+          <w:rStyle w:val="CommentReference"/>
+        </w:rPr>
+        <w:commentReference w:id="9"/>
+      </w:r>
+      <w:commentRangeEnd w:id="10"/>
+      <w:r>
+        <w:rPr>
+          <w:rStyle w:val="CommentReference"/>
+        </w:rPr>
+        <w:commentReference w:id="10"/>
+      </w:r>
+      <w:r>
+        <w:rPr>
+          <w:rFonts w:ascii="Arial" w:hAnsi="Arial" w:cs="Arial"/>
+          <w:color w:val="000000"/>
+          <w:sz w:val="22"/>
+          <w:szCs w:val="22"/>
+        </w:rPr>
+        <w:t xml:space="preserve">, the instance of one viral infection impeding the replication and dissemination of another viral infection of the same or similar virus </w:t>
+      </w:r>
+      <w:r>
+        <w:rPr>
+          <w:rFonts w:ascii="Arial" w:hAnsi="Arial" w:cs="Arial"/>
+          <w:color w:val="000000"/>
+          <w:sz w:val="22"/>
+          <w:szCs w:val="22"/>
+        </w:rPr>
+        <w:lastRenderedPageBreak/>
+        <w:t xml:space="preserve">has been well documented. Due to the presence of coinfections in our samples, we </w:t>
+      </w:r>
+      <w:commentRangeStart w:id="11"/>
+      <w:r>
+        <w:rPr>
+          <w:rFonts w:ascii="Arial" w:hAnsi="Arial" w:cs="Arial"/>
+          <w:color w:val="000000"/>
+          <w:sz w:val="22"/>
+          <w:szCs w:val="22"/>
+        </w:rPr>
+        <w:t xml:space="preserve">removed all samples </w:t>
+      </w:r>
+      <w:commentRangeEnd w:id="11"/>
+      <w:r>
+        <w:rPr>
+          <w:rStyle w:val="CommentReference"/>
+        </w:rPr>
+        <w:commentReference w:id="11"/>
+      </w:r>
+      <w:r>
+        <w:rPr>
+          <w:rFonts w:ascii="Arial" w:hAnsi="Arial" w:cs="Arial"/>
+          <w:color w:val="000000"/>
+          <w:sz w:val="22"/>
+          <w:szCs w:val="22"/>
+        </w:rPr>
+        <w:t xml:space="preserve">with evidence of a coinfection from the analyses used for </w:t>
+      </w:r>
+      <w:r>
+        <w:rPr>
+          <w:rFonts w:ascii="Arial" w:hAnsi="Arial" w:cs="Arial"/>
+          <w:b/>
+          <w:bCs/>
+          <w:color w:val="000000"/>
+          <w:sz w:val="22"/>
+          <w:szCs w:val="22"/>
+        </w:rPr>
+        <w:t>Figure 9</w:t>
+      </w:r>
+      <w:r>
+        <w:rPr>
+          <w:rFonts w:ascii="Arial" w:hAnsi="Arial" w:cs="Arial"/>
+          <w:color w:val="000000"/>
+          <w:sz w:val="22"/>
+          <w:szCs w:val="22"/>
+        </w:rPr>
+        <w:t xml:space="preserve"> and </w:t>
+      </w:r>
+      <w:r>
+        <w:rPr>
+          <w:rFonts w:ascii="Arial" w:hAnsi="Arial" w:cs="Arial"/>
+          <w:b/>
+          <w:bCs/>
+          <w:color w:val="000000"/>
+          <w:sz w:val="22"/>
+          <w:szCs w:val="22"/>
+        </w:rPr>
+        <w:t>Supplemental Figure 7</w:t>
+      </w:r>
+      <w:r>
+        <w:rPr>
+          <w:rFonts w:ascii="Arial" w:hAnsi="Arial" w:cs="Arial"/>
+          <w:color w:val="000000"/>
+          <w:sz w:val="22"/>
+          <w:szCs w:val="22"/>
+        </w:rPr>
+        <w:t>.</w:t>
+      </w:r>
+    </w:p>
+    <w:p>
+      <w:pPr>
+        <w:spacing w:line="360" w:lineRule="auto"/>
+        <w:ind w:firstLine="720"/>
+        <w:rPr>
+          <w:rFonts w:ascii="Arial" w:hAnsi="Arial" w:cs="Arial"/>
+          <w:sz w:val="22"/>
+          <w:szCs w:val="22"/>
+        </w:rPr>
+      </w:pPr>
+      <w:commentRangeStart w:id="12"/>
+      <w:commentRangeStart w:id="13"/>
+      <w:r>
+        <w:rPr>
+          <w:rFonts w:ascii="Arial" w:hAnsi="Arial" w:cs="Arial"/>
+          <w:sz w:val="22"/>
+          <w:szCs w:val="22"/>
+        </w:rPr>
+        <w:t xml:space="preserve">We explored the potential of using time resolved phylogenetic methods </w:t>
+      </w:r>
+      <w:commentRangeEnd w:id="12"/>
+      <w:r>
+        <w:rPr>
+          <w:rStyle w:val="CommentReference"/>
+        </w:rPr>
+        <w:commentReference w:id="12"/>
+      </w:r>
+      <w:commentRangeEnd w:id="13"/>
+      <w:r>
+        <w:rPr>
+          <w:rStyle w:val="CommentReference"/>
+        </w:rPr>
+        <w:commentReference w:id="13"/>
+      </w:r>
+      <w:r>
+        <w:rPr>
+          <w:rFonts w:ascii="Arial" w:hAnsi="Arial" w:cs="Arial"/>
+          <w:sz w:val="22"/>
+          <w:szCs w:val="22"/>
+        </w:rPr>
+        <w:t>to predict how long galbut virus has been infecting flies, when galbut virus jumped between hosts and to estimate the evolutionary rate. Even with 100+ sequences from diverse locations and sequences over 110-years-old, there was not enough diversity to identify a time signal when we tested with TempEst</w:t>
+      </w:r>
+      <w:r>
+        <w:rPr>
+          <w:rFonts w:ascii="Arial" w:hAnsi="Arial" w:cs="Arial"/>
+          <w:color w:val="000000"/>
+          <w:sz w:val="22"/>
+          <w:szCs w:val="22"/>
+        </w:rPr>
+        <w:t xml:space="preserve">. </w:t>
+      </w:r>
+      <w:r>
+        <w:rPr>
+          <w:rFonts w:ascii="Arial" w:hAnsi="Arial" w:cs="Arial"/>
+          <w:sz w:val="22"/>
+          <w:szCs w:val="22"/>
+        </w:rPr>
+        <w:t xml:space="preserve">Galbut virus is simply not evolving fast enough to use tools like BEAST to estimate a time to most recent common ancestor. A pattern that has been shown in other partitiviruses. </w:t>
+      </w:r>
+    </w:p>
+    <w:p>
+      <w:pPr>
+        <w:spacing w:line="360" w:lineRule="auto"/>
+        <w:ind w:firstLine="720"/>
+        <w:rPr>
+          <w:rFonts w:ascii="Arial" w:hAnsi="Arial" w:cs="Arial"/>
+          <w:sz w:val="22"/>
+          <w:szCs w:val="22"/>
+        </w:rPr>
+      </w:pPr>
+      <w:r>
+        <w:rPr>
+          <w:rFonts w:ascii="Arial" w:hAnsi="Arial" w:cs="Arial"/>
+          <w:color w:val="000000"/>
+          <w:sz w:val="22"/>
+          <w:szCs w:val="22"/>
+        </w:rPr>
+        <w:tab/>
+      </w:r>
+      <w:commentRangeStart w:id="14"/>
+      <w:r>
+        <w:rPr>
+          <w:rFonts w:ascii="Arial" w:hAnsi="Arial" w:cs="Arial"/>
+          <w:sz w:val="22"/>
+          <w:szCs w:val="22"/>
+        </w:rPr>
+        <w:t xml:space="preserve">One way to explain the apparent lack of evolution </w:t>
+      </w:r>
+      <w:commentRangeEnd w:id="14"/>
+      <w:r>
+        <w:rPr>
+          <w:rStyle w:val="CommentReference"/>
+        </w:rPr>
+        <w:commentReference w:id="14"/>
+      </w:r>
+      <w:r>
+        <w:rPr>
+          <w:rFonts w:ascii="Arial" w:hAnsi="Arial" w:cs="Arial"/>
+          <w:sz w:val="22"/>
+          <w:szCs w:val="22"/>
+        </w:rPr>
+        <w:t xml:space="preserve">is by looking at the factors that allow a persistent viral infection like galbut virus to maintain itself in a population. Highly studied persistent viral infections are generally acute infections that become persistent. Galbut virus is transmitted vertically and occurs over the lifetime of the host. This close virus-host relationship implies that the pressures on galbut virus are different than other persistent infections. One possible way to explain this interaction is the prisoner of war hypothesis. Constraints have been placed on how much galbut virus can evolve due to its close relationship with the host. If the virus mutates in a way that limits </w:t>
+      </w:r>
+      <w:r>
+        <w:rPr>
+          <w:rFonts w:ascii="Arial" w:hAnsi="Arial" w:cs="Arial"/>
+          <w:i/>
+          <w:iCs/>
+          <w:sz w:val="22"/>
+          <w:szCs w:val="22"/>
+        </w:rPr>
+        <w:t>D. melanogaster’s</w:t>
+      </w:r>
+      <w:r>
+        <w:rPr>
+          <w:rFonts w:ascii="Arial" w:hAnsi="Arial" w:cs="Arial"/>
+          <w:sz w:val="22"/>
+          <w:szCs w:val="22"/>
+        </w:rPr>
+        <w:t xml:space="preserve"> fitness leading to lower fecundity, premature death or offspring mortality, then it will be detrimental to the virus.</w:t>
+      </w:r>
+    </w:p>
+    <w:p>
+      <w:pPr>
+        <w:spacing w:line="360" w:lineRule="auto"/>
+        <w:rPr>
+          <w:rFonts w:ascii="Arial" w:hAnsi="Arial" w:cs="Arial"/>
+          <w:color w:val="000000"/>
+          <w:sz w:val="22"/>
+          <w:szCs w:val="22"/>
+        </w:rPr>
+      </w:pPr>
+    </w:p>
+    <w:p>
+      <w:pPr>
+        <w:spacing w:line="360" w:lineRule="auto"/>
+        <w:ind w:firstLine="720"/>
+        <w:rPr>
+          <w:rFonts w:ascii="Arial" w:hAnsi="Arial" w:cs="Arial"/>
+          <w:sz w:val="22"/>
+          <w:szCs w:val="22"/>
+        </w:rPr>
+      </w:pPr>
     </w:p>
     <w:p/>
     <w:sectPr>
@@ -595,6 +984,135 @@
       </w:r>
     </w:p>
   </w:comment>
+  <w:comment w:id="9" w:author="Stenglein,Mark" w:date="2025-03-12T16:40:00Z" w:initials="MS">
+    <w:p>
+      <w:r>
+        <w:rPr>
+          <w:rStyle w:val="CommentReference"/>
+        </w:rPr>
+        <w:annotationRef/>
+      </w:r>
+      <w:r>
+        <w:rPr>
+          <w:color w:val="000000"/>
+          <w:sz w:val="20"/>
+          <w:szCs w:val="20"/>
+        </w:rPr>
+        <w:t>I like that you are introducing superinfection exclusion.  But I think it’s not related to these plots.</w:t>
+      </w:r>
+    </w:p>
+    <w:p/>
+    <w:p>
+      <w:r>
+        <w:rPr>
+          <w:color w:val="000000"/>
+          <w:sz w:val="20"/>
+          <w:szCs w:val="20"/>
+        </w:rPr>
+        <w:t xml:space="preserve">Co-infections by definition have not been prevented by superinfection exclusion. </w:t>
+      </w:r>
+    </w:p>
+    <w:p/>
+    <w:p>
+      <w:r>
+        <w:rPr>
+          <w:color w:val="000000"/>
+          <w:sz w:val="20"/>
+          <w:szCs w:val="20"/>
+        </w:rPr>
+        <w:t>Superinfection exclusion could be evident in patterns of co-infeciton, for instance if you did not see co-infeciton by multiple As or if you did not see co-infection by As and Bs.</w:t>
+      </w:r>
+    </w:p>
+  </w:comment>
+  <w:comment w:id="10" w:author="Stenglein,Mark" w:date="2025-03-12T16:41:00Z" w:initials="MS">
+    <w:p>
+      <w:r>
+        <w:rPr>
+          <w:rStyle w:val="CommentReference"/>
+        </w:rPr>
+        <w:annotationRef/>
+      </w:r>
+      <w:r>
+        <w:rPr>
+          <w:color w:val="000000"/>
+          <w:sz w:val="20"/>
+          <w:szCs w:val="20"/>
+        </w:rPr>
+        <w:t>So I don’t think you need this paragraph.  If you want to address possible evidence of super-infection exclusion (or absence of evidence) - make a separate paragraph about that.  Here, you can just say you omitted co-infected samples in the figure legends.</w:t>
+      </w:r>
+    </w:p>
+  </w:comment>
+  <w:comment w:id="11" w:author="Stenglein,Mark" w:date="2025-03-12T16:33:00Z" w:initials="MS">
+    <w:p>
+      <w:r>
+        <w:rPr>
+          <w:rStyle w:val="CommentReference"/>
+        </w:rPr>
+        <w:annotationRef/>
+      </w:r>
+      <w:r>
+        <w:rPr>
+          <w:color w:val="000000"/>
+          <w:sz w:val="20"/>
+          <w:szCs w:val="20"/>
+        </w:rPr>
+        <w:t>What about simulans?  I suppose they don’t count as A?</w:t>
+      </w:r>
+    </w:p>
+  </w:comment>
+  <w:comment w:id="12" w:author="Stenglein,Mark" w:date="2025-03-12T17:07:00Z" w:initials="MS">
+    <w:p>
+      <w:r>
+        <w:rPr>
+          <w:rStyle w:val="CommentReference"/>
+        </w:rPr>
+        <w:annotationRef/>
+      </w:r>
+      <w:r>
+        <w:rPr>
+          <w:sz w:val="20"/>
+          <w:szCs w:val="20"/>
+        </w:rPr>
+        <w:t>This is similar to my previous comment (I think from Introduction).  I know you are invested in these time-related questions but you don’t present any estimates of rates or anything like that in the results of this paper, so this comes across as off topic.  You should focus the discussion on aspects of galbut virus that you address in the results.</w:t>
+      </w:r>
+    </w:p>
+  </w:comment>
+  <w:comment w:id="13" w:author="Stenglein,Mark" w:date="2025-03-12T17:08:00Z" w:initials="MS">
+    <w:p>
+      <w:r>
+        <w:rPr>
+          <w:rStyle w:val="CommentReference"/>
+        </w:rPr>
+        <w:annotationRef/>
+      </w:r>
+      <w:r>
+        <w:rPr>
+          <w:color w:val="000000"/>
+          <w:sz w:val="20"/>
+          <w:szCs w:val="20"/>
+        </w:rPr>
+        <w:t>Like following paragraph, this may be a candidate for thesis conclusion?</w:t>
+      </w:r>
+    </w:p>
+  </w:comment>
+  <w:comment w:id="14" w:author="Stenglein,Mark" w:date="2025-03-12T17:06:00Z" w:initials="MS">
+    <w:p>
+      <w:r>
+        <w:rPr>
+          <w:rStyle w:val="CommentReference"/>
+        </w:rPr>
+        <w:annotationRef/>
+      </w:r>
+      <w:r>
+        <w:rPr>
+          <w:color w:val="000000"/>
+          <w:sz w:val="20"/>
+          <w:szCs w:val="20"/>
+        </w:rPr>
+        <w:t>This paragraph is interesting but not really all that related to what you talk about in the results section.  You may want to move this to your thesis - perhaps the conclusion section.</w:t>
+      </w:r>
+    </w:p>
+  </w:comment>
 </w:comments>
 </file>
 
@@ -605,6 +1123,12 @@
   <w15:commentEx w15:paraId="2E4772CF" w15:done="0"/>
   <w15:commentEx w15:paraId="060C333D" w15:paraIdParent="2E4772CF" w15:done="0"/>
   <w15:commentEx w15:paraId="1D165BF1" w15:done="0"/>
+  <w15:commentEx w15:paraId="51A44752" w15:done="0"/>
+  <w15:commentEx w15:paraId="265105EF" w15:paraIdParent="51A44752" w15:done="0"/>
+  <w15:commentEx w15:paraId="0D5D5FF1" w15:done="0"/>
+  <w15:commentEx w15:paraId="6FB6408E" w15:done="0"/>
+  <w15:commentEx w15:paraId="3DD774E8" w15:paraIdParent="6FB6408E" w15:done="0"/>
+  <w15:commentEx w15:paraId="33AAAB35" w15:done="0"/>
 </w15:commentsEx>
 </file>
 
@@ -615,6 +1139,12 @@
   <w16cex:commentExtensible w16cex:durableId="47A49CE4" w16cex:dateUtc="2025-03-06T20:48:00Z"/>
   <w16cex:commentExtensible w16cex:durableId="571CAAE5" w16cex:dateUtc="2025-03-06T20:48:00Z"/>
   <w16cex:commentExtensible w16cex:durableId="135073DA" w16cex:dateUtc="2025-03-04T23:51:00Z"/>
+  <w16cex:commentExtensible w16cex:durableId="1A47B1A2" w16cex:dateUtc="2025-03-12T22:40:00Z"/>
+  <w16cex:commentExtensible w16cex:durableId="7E43153F" w16cex:dateUtc="2025-03-12T22:41:00Z"/>
+  <w16cex:commentExtensible w16cex:durableId="7E9F97BB" w16cex:dateUtc="2025-03-12T22:33:00Z"/>
+  <w16cex:commentExtensible w16cex:durableId="357555BC" w16cex:dateUtc="2025-03-12T23:07:00Z"/>
+  <w16cex:commentExtensible w16cex:durableId="05CCBE73" w16cex:dateUtc="2025-03-12T23:08:00Z"/>
+  <w16cex:commentExtensible w16cex:durableId="6EB6DF06" w16cex:dateUtc="2025-03-12T23:06:00Z"/>
 </w16cex:commentsExtensible>
 </file>
 
@@ -625,6 +1155,12 @@
   <w16cid:commentId w16cid:paraId="2E4772CF" w16cid:durableId="47A49CE4"/>
   <w16cid:commentId w16cid:paraId="060C333D" w16cid:durableId="571CAAE5"/>
   <w16cid:commentId w16cid:paraId="1D165BF1" w16cid:durableId="135073DA"/>
+  <w16cid:commentId w16cid:paraId="51A44752" w16cid:durableId="1A47B1A2"/>
+  <w16cid:commentId w16cid:paraId="265105EF" w16cid:durableId="7E43153F"/>
+  <w16cid:commentId w16cid:paraId="0D5D5FF1" w16cid:durableId="7E9F97BB"/>
+  <w16cid:commentId w16cid:paraId="6FB6408E" w16cid:durableId="357555BC"/>
+  <w16cid:commentId w16cid:paraId="3DD774E8" w16cid:durableId="05CCBE73"/>
+  <w16cid:commentId w16cid:paraId="33AAAB35" w16cid:durableId="6EB6DF06"/>
 </w16cid:commentsIds>
 </file>
 
@@ -1713,9 +2249,12 @@
     <w:rsidRoot w:val="00B07FFA"/>
     <w:rsid w:val="000210F9"/>
     <w:rsid w:val="002B1A7D"/>
+    <w:rsid w:val="003646DC"/>
+    <w:rsid w:val="003E0C2A"/>
     <w:rsid w:val="004E0330"/>
     <w:rsid w:val="006330C7"/>
     <w:rsid w:val="0068160F"/>
+    <w:rsid w:val="008C542D"/>
     <w:rsid w:val="00A81DF1"/>
     <w:rsid w:val="00B07FFA"/>
     <w:rsid w:val="00BB37A8"/>

</xml_diff>